<commit_message>
docs(case-study): full screenshot refresh at 2x + lossless PDFs + maintained capture pipeline
All 75+ screens recaptured from the current app (motion frozen, 2x
device scale, 3x mobile) covering everything shipped since the last
edition: taxes in the fare summary, the ledger e-ticket rendered from
its actual download, trip filter chips, seat change, the cancellation
tiers dialog. Media swapped surgically into the frontend and recruiter
DOCX with aspect-corrected extents - the reviewed prose is untouched -
and both PDFs re-exported with lossless images and downsampling off.
capture-all-screens.mjs is now the one canonical v3 script (public +
authenticated + admin + mobile + RTL + the download-render technique).
</commit_message>
<xml_diff>
--- a/docs/case-study/SkyBook-Case-Study-Recruiter.docx
+++ b/docs/case-study/SkyBook-Case-Study-Recruiter.docx
@@ -1508,7 +1508,7 @@
       <w:r>
         <w:drawing>
           <wp:inline distT="0" distB="0" distL="0" distR="0">
-            <wp:extent cx="6496050" cy="4505325"/>
+            <wp:extent cx="6496050" cy="4511146"/>
             <wp:effectExtent t="0" r="0" b="0" l="0"/>
             <wp:docPr id="1" name="" descr="" title=""/>
             <wp:cNvGraphicFramePr>
@@ -1533,7 +1533,7 @@
                   <pic:spPr bwMode="auto">
                     <a:xfrm>
                       <a:off x="0" y="0"/>
-                      <a:ext cx="6496050" cy="4505325"/>
+                      <a:ext cx="6496050" cy="4511146"/>
                     </a:xfrm>
                     <a:prstGeom prst="rect">
                       <a:avLst/>
@@ -1571,7 +1571,7 @@
       <w:r>
         <w:drawing>
           <wp:inline distT="0" distB="0" distL="0" distR="0">
-            <wp:extent cx="4324350" cy="7867650"/>
+            <wp:extent cx="4324350" cy="7948996"/>
             <wp:effectExtent t="0" r="0" b="0" l="0"/>
             <wp:docPr id="1" name="" descr="" title=""/>
             <wp:cNvGraphicFramePr>
@@ -1596,7 +1596,7 @@
                   <pic:spPr bwMode="auto">
                     <a:xfrm>
                       <a:off x="0" y="0"/>
-                      <a:ext cx="4324350" cy="7867650"/>
+                      <a:ext cx="4324350" cy="7948996"/>
                     </a:xfrm>
                     <a:prstGeom prst="rect">
                       <a:avLst/>
@@ -1639,7 +1639,7 @@
       <w:r>
         <w:drawing>
           <wp:inline distT="0" distB="0" distL="0" distR="0">
-            <wp:extent cx="6496050" cy="4991100"/>
+            <wp:extent cx="6496050" cy="5084061"/>
             <wp:effectExtent t="0" r="0" b="0" l="0"/>
             <wp:docPr id="1" name="" descr="" title=""/>
             <wp:cNvGraphicFramePr>
@@ -1664,7 +1664,7 @@
                   <pic:spPr bwMode="auto">
                     <a:xfrm>
                       <a:off x="0" y="0"/>
-                      <a:ext cx="6496050" cy="4991100"/>
+                      <a:ext cx="6496050" cy="5084061"/>
                     </a:xfrm>
                     <a:prstGeom prst="rect">
                       <a:avLst/>
@@ -1702,7 +1702,7 @@
       <w:r>
         <w:drawing>
           <wp:inline distT="0" distB="0" distL="0" distR="0">
-            <wp:extent cx="5133975" cy="7867650"/>
+            <wp:extent cx="5133975" cy="7939835"/>
             <wp:effectExtent t="0" r="0" b="0" l="0"/>
             <wp:docPr id="1" name="" descr="" title=""/>
             <wp:cNvGraphicFramePr>
@@ -1727,7 +1727,7 @@
                   <pic:spPr bwMode="auto">
                     <a:xfrm>
                       <a:off x="0" y="0"/>
-                      <a:ext cx="5133975" cy="7867650"/>
+                      <a:ext cx="5133975" cy="7939835"/>
                     </a:xfrm>
                     <a:prstGeom prst="rect">
                       <a:avLst/>

</xml_diff>